<commit_message>
Todo-Liste: ohne Datum, nur Reihenfolge
Rueckmeldung von Kira: "Ohne Datum nur Reihenfolge."

Aus sieben datierten Bloecken wird eine einzige durchnummerierte Liste von
1 bis 50. Was oben steht, kommt zuerst; was unten steht, setzt meistens
etwas weiter oben voraus. Keine Abschnitte, keine Daten, keine Tabellen.

  1.  ☐  Ladungsfaehige Anschrift festlegen   · beide

Ausnahme sind die vier Aufgaben, die an einem Ereignis haengen statt an
einer Frist. Bei ihnen ist die Reihenfolge allein keine Anweisung, deshalb
tragen sie ihren Ausloeser weiter im Text: "vor der ersten Rechnung",
"am Tag der ersten Absage". Dasselbe gilt fuer "laufend" und "jede Woche".

Die Termine sind nicht verloren, sie stehen weiter in aufgaben.json und in
der Uebersicht des Konzepts. Sie stehen nur nicht mehr auf dem Blatt, das
abgehakt wird.

Co-Authored-By: Claude Opus 5 <noreply@anthropic.com>
Claude-Session: https://claude.ai/code/session_01LTzG2LQUXUCGRg9kWDQJKD
</commit_message>
<xml_diff>
--- a/studie/word/Webgewerk-Todo.docx
+++ b/studie/word/Webgewerk-Todo.docx
@@ -28,7 +28,7 @@
           <w:sz w:val="22"/>
           <w:szCs w:val="22"/>
         </w:rPr>
-        <w:t xml:space="preserve">Webgewerk · Stand 19.08.2026 · eine Zeile je Aufgabe, mit Namen und Datum.</w:t>
+        <w:t xml:space="preserve">Webgewerk · Stand 19.08.2026 · in der Reihenfolge, in der es gemacht wird.</w:t>
       </w:r>
     </w:p>
     <w:p>
@@ -45,26 +45,22 @@
           <w:sz w:val="22"/>
           <w:szCs w:val="22"/>
         </w:rPr>
-        <w:t xml:space="preserve">Warum eine Aufgabe drinsteht, steht im Unternehmenskonzept. Zum Abhaken braucht man es nicht.</w:t>
-      </w:r>
-    </w:p>
-    <w:p>
-      <w:pPr>
-        <w:pStyle w:val="Heading1"/>
-        <w:spacing w:after="120" w:before="320"/>
-      </w:pPr>
-      <w:r>
-        <w:rPr>
-          <w:color w:val="000000"/>
-        </w:rPr>
-        <w:t xml:space="preserve">Bis Freitag, 21.08.2026</w:t>
-      </w:r>
-    </w:p>
-    <w:p>
-      <w:pPr>
-        <w:spacing w:after="100" w:line="264"/>
-        <w:ind w:left="340" w:hanging="340"/>
-      </w:pPr>
+        <w:t xml:space="preserve">Von oben nach unten. Was weiter unten steht, setzt meistens etwas weiter oben voraus. Warum eine Aufgabe drinsteht, steht im Unternehmenskonzept — zum Abhaken braucht man es nicht.</w:t>
+      </w:r>
+    </w:p>
+    <w:p>
+      <w:pPr>
+        <w:spacing w:after="100" w:line="264"/>
+        <w:ind w:left="560" w:hanging="560"/>
+      </w:pPr>
+      <w:r>
+        <w:rPr>
+          <w:color w:val="000000"/>
+          <w:sz w:val="22"/>
+          <w:szCs w:val="22"/>
+        </w:rPr>
+        <w:t xml:space="preserve"> 1.  </w:t>
+      </w:r>
       <w:r>
         <w:rPr>
           <w:color w:val="000000"/>
@@ -87,14 +83,22 @@
           <w:sz w:val="20"/>
           <w:szCs w:val="20"/>
         </w:rPr>
-        <w:t xml:space="preserve">   (beide, 21.08.)</w:t>
-      </w:r>
-    </w:p>
-    <w:p>
-      <w:pPr>
-        <w:spacing w:after="100" w:line="264"/>
-        <w:ind w:left="340" w:hanging="340"/>
-      </w:pPr>
+        <w:t xml:space="preserve">   · beide</w:t>
+      </w:r>
+    </w:p>
+    <w:p>
+      <w:pPr>
+        <w:spacing w:after="100" w:line="264"/>
+        <w:ind w:left="560" w:hanging="560"/>
+      </w:pPr>
+      <w:r>
+        <w:rPr>
+          <w:color w:val="000000"/>
+          <w:sz w:val="22"/>
+          <w:szCs w:val="22"/>
+        </w:rPr>
+        <w:t xml:space="preserve"> 2.  </w:t>
+      </w:r>
       <w:r>
         <w:rPr>
           <w:color w:val="000000"/>
@@ -117,14 +121,22 @@
           <w:sz w:val="20"/>
           <w:szCs w:val="20"/>
         </w:rPr>
-        <w:t xml:space="preserve">   (beide, 21.08.)</w:t>
-      </w:r>
-    </w:p>
-    <w:p>
-      <w:pPr>
-        <w:spacing w:after="100" w:line="264"/>
-        <w:ind w:left="340" w:hanging="340"/>
-      </w:pPr>
+        <w:t xml:space="preserve">   · beide</w:t>
+      </w:r>
+    </w:p>
+    <w:p>
+      <w:pPr>
+        <w:spacing w:after="100" w:line="264"/>
+        <w:ind w:left="560" w:hanging="560"/>
+      </w:pPr>
+      <w:r>
+        <w:rPr>
+          <w:color w:val="000000"/>
+          <w:sz w:val="22"/>
+          <w:szCs w:val="22"/>
+        </w:rPr>
+        <w:t xml:space="preserve"> 3.  </w:t>
+      </w:r>
       <w:r>
         <w:rPr>
           <w:color w:val="000000"/>
@@ -147,44 +159,60 @@
           <w:sz w:val="20"/>
           <w:szCs w:val="20"/>
         </w:rPr>
-        <w:t xml:space="preserve">   (beide, 21.08.)</w:t>
-      </w:r>
-    </w:p>
-    <w:p>
-      <w:pPr>
-        <w:spacing w:after="100" w:line="264"/>
-        <w:ind w:left="340" w:hanging="340"/>
-      </w:pPr>
-      <w:r>
-        <w:rPr>
-          <w:color w:val="000000"/>
-          <w:sz w:val="22"/>
-          <w:szCs w:val="22"/>
-        </w:rPr>
-        <w:t xml:space="preserve">☐   </w:t>
-      </w:r>
-      <w:r>
-        <w:rPr>
-          <w:color w:val="000000"/>
-          <w:sz w:val="22"/>
-          <w:szCs w:val="22"/>
-        </w:rPr>
-        <w:t xml:space="preserve">Tag 1 als festes Datum setzen — Vorschlag: Montag, 05.10.2026</w:t>
-      </w:r>
-      <w:r>
-        <w:rPr>
-          <w:color w:val="000000"/>
-          <w:sz w:val="20"/>
-          <w:szCs w:val="20"/>
-        </w:rPr>
-        <w:t xml:space="preserve">   (beide, 21.08.)</w:t>
-      </w:r>
-    </w:p>
-    <w:p>
-      <w:pPr>
-        <w:spacing w:after="100" w:line="264"/>
-        <w:ind w:left="340" w:hanging="340"/>
-      </w:pPr>
+        <w:t xml:space="preserve">   · beide</w:t>
+      </w:r>
+    </w:p>
+    <w:p>
+      <w:pPr>
+        <w:spacing w:after="100" w:line="264"/>
+        <w:ind w:left="560" w:hanging="560"/>
+      </w:pPr>
+      <w:r>
+        <w:rPr>
+          <w:color w:val="000000"/>
+          <w:sz w:val="22"/>
+          <w:szCs w:val="22"/>
+        </w:rPr>
+        <w:t xml:space="preserve"> 4.  </w:t>
+      </w:r>
+      <w:r>
+        <w:rPr>
+          <w:color w:val="000000"/>
+          <w:sz w:val="22"/>
+          <w:szCs w:val="22"/>
+        </w:rPr>
+        <w:t xml:space="preserve">☐   </w:t>
+      </w:r>
+      <w:r>
+        <w:rPr>
+          <w:color w:val="000000"/>
+          <w:sz w:val="22"/>
+          <w:szCs w:val="22"/>
+        </w:rPr>
+        <w:t xml:space="preserve">Tag 1 festlegen: der Tag, an dem der erste Check übergeben wird</w:t>
+      </w:r>
+      <w:r>
+        <w:rPr>
+          <w:color w:val="000000"/>
+          <w:sz w:val="20"/>
+          <w:szCs w:val="20"/>
+        </w:rPr>
+        <w:t xml:space="preserve">   · beide</w:t>
+      </w:r>
+    </w:p>
+    <w:p>
+      <w:pPr>
+        <w:spacing w:after="100" w:line="264"/>
+        <w:ind w:left="560" w:hanging="560"/>
+      </w:pPr>
+      <w:r>
+        <w:rPr>
+          <w:color w:val="000000"/>
+          <w:sz w:val="22"/>
+          <w:szCs w:val="22"/>
+        </w:rPr>
+        <w:t xml:space="preserve"> 5.  </w:t>
+      </w:r>
       <w:r>
         <w:rPr>
           <w:color w:val="000000"/>
@@ -207,14 +235,22 @@
           <w:sz w:val="20"/>
           <w:szCs w:val="20"/>
         </w:rPr>
-        <w:t xml:space="preserve">   (beide, 21.08.)</w:t>
-      </w:r>
-    </w:p>
-    <w:p>
-      <w:pPr>
-        <w:spacing w:after="100" w:line="264"/>
-        <w:ind w:left="340" w:hanging="340"/>
-      </w:pPr>
+        <w:t xml:space="preserve">   · beide</w:t>
+      </w:r>
+    </w:p>
+    <w:p>
+      <w:pPr>
+        <w:spacing w:after="100" w:line="264"/>
+        <w:ind w:left="560" w:hanging="560"/>
+      </w:pPr>
+      <w:r>
+        <w:rPr>
+          <w:color w:val="000000"/>
+          <w:sz w:val="22"/>
+          <w:szCs w:val="22"/>
+        </w:rPr>
+        <w:t xml:space="preserve"> 6.  </w:t>
+      </w:r>
       <w:r>
         <w:rPr>
           <w:color w:val="000000"/>
@@ -237,14 +273,22 @@
           <w:sz w:val="20"/>
           <w:szCs w:val="20"/>
         </w:rPr>
-        <w:t xml:space="preserve">   (beide, 21.08.)</w:t>
-      </w:r>
-    </w:p>
-    <w:p>
-      <w:pPr>
-        <w:spacing w:after="100" w:line="264"/>
-        <w:ind w:left="340" w:hanging="340"/>
-      </w:pPr>
+        <w:t xml:space="preserve">   · beide</w:t>
+      </w:r>
+    </w:p>
+    <w:p>
+      <w:pPr>
+        <w:spacing w:after="100" w:line="264"/>
+        <w:ind w:left="560" w:hanging="560"/>
+      </w:pPr>
+      <w:r>
+        <w:rPr>
+          <w:color w:val="000000"/>
+          <w:sz w:val="22"/>
+          <w:szCs w:val="22"/>
+        </w:rPr>
+        <w:t xml:space="preserve"> 7.  </w:t>
+      </w:r>
       <w:r>
         <w:rPr>
           <w:color w:val="000000"/>
@@ -267,14 +311,22 @@
           <w:sz w:val="20"/>
           <w:szCs w:val="20"/>
         </w:rPr>
-        <w:t xml:space="preserve">   (beide, 21.08.)</w:t>
-      </w:r>
-    </w:p>
-    <w:p>
-      <w:pPr>
-        <w:spacing w:after="100" w:line="264"/>
-        <w:ind w:left="340" w:hanging="340"/>
-      </w:pPr>
+        <w:t xml:space="preserve">   · beide</w:t>
+      </w:r>
+    </w:p>
+    <w:p>
+      <w:pPr>
+        <w:spacing w:after="100" w:line="264"/>
+        <w:ind w:left="560" w:hanging="560"/>
+      </w:pPr>
+      <w:r>
+        <w:rPr>
+          <w:color w:val="000000"/>
+          <w:sz w:val="22"/>
+          <w:szCs w:val="22"/>
+        </w:rPr>
+        <w:t xml:space="preserve"> 8.  </w:t>
+      </w:r>
       <w:r>
         <w:rPr>
           <w:color w:val="000000"/>
@@ -297,14 +349,22 @@
           <w:sz w:val="20"/>
           <w:szCs w:val="20"/>
         </w:rPr>
-        <w:t xml:space="preserve">   (Kira, 21.08.)</w:t>
-      </w:r>
-    </w:p>
-    <w:p>
-      <w:pPr>
-        <w:spacing w:after="100" w:line="264"/>
-        <w:ind w:left="340" w:hanging="340"/>
-      </w:pPr>
+        <w:t xml:space="preserve">   · Kira</w:t>
+      </w:r>
+    </w:p>
+    <w:p>
+      <w:pPr>
+        <w:spacing w:after="100" w:line="264"/>
+        <w:ind w:left="560" w:hanging="560"/>
+      </w:pPr>
+      <w:r>
+        <w:rPr>
+          <w:color w:val="000000"/>
+          <w:sz w:val="22"/>
+          <w:szCs w:val="22"/>
+        </w:rPr>
+        <w:t xml:space="preserve"> 9.  </w:t>
+      </w:r>
       <w:r>
         <w:rPr>
           <w:color w:val="000000"/>
@@ -327,26 +387,22 @@
           <w:sz w:val="20"/>
           <w:szCs w:val="20"/>
         </w:rPr>
-        <w:t xml:space="preserve">   (Yannik, 21.08.)</w:t>
-      </w:r>
-    </w:p>
-    <w:p>
-      <w:pPr>
-        <w:pStyle w:val="Heading1"/>
-        <w:spacing w:after="120" w:before="320"/>
-      </w:pPr>
-      <w:r>
-        <w:rPr>
-          <w:color w:val="000000"/>
-        </w:rPr>
-        <w:t xml:space="preserve">Bis Freitag, 28.08.2026</w:t>
-      </w:r>
-    </w:p>
-    <w:p>
-      <w:pPr>
-        <w:spacing w:after="100" w:line="264"/>
-        <w:ind w:left="340" w:hanging="340"/>
-      </w:pPr>
+        <w:t xml:space="preserve">   · Yannik</w:t>
+      </w:r>
+    </w:p>
+    <w:p>
+      <w:pPr>
+        <w:spacing w:after="100" w:line="264"/>
+        <w:ind w:left="560" w:hanging="560"/>
+      </w:pPr>
+      <w:r>
+        <w:rPr>
+          <w:color w:val="000000"/>
+          <w:sz w:val="22"/>
+          <w:szCs w:val="22"/>
+        </w:rPr>
+        <w:t xml:space="preserve">10.  </w:t>
+      </w:r>
       <w:r>
         <w:rPr>
           <w:color w:val="000000"/>
@@ -369,14 +425,22 @@
           <w:sz w:val="20"/>
           <w:szCs w:val="20"/>
         </w:rPr>
-        <w:t xml:space="preserve">   (beide, 28.08.)</w:t>
-      </w:r>
-    </w:p>
-    <w:p>
-      <w:pPr>
-        <w:spacing w:after="100" w:line="264"/>
-        <w:ind w:left="340" w:hanging="340"/>
-      </w:pPr>
+        <w:t xml:space="preserve">   · beide</w:t>
+      </w:r>
+    </w:p>
+    <w:p>
+      <w:pPr>
+        <w:spacing w:after="100" w:line="264"/>
+        <w:ind w:left="560" w:hanging="560"/>
+      </w:pPr>
+      <w:r>
+        <w:rPr>
+          <w:color w:val="000000"/>
+          <w:sz w:val="22"/>
+          <w:szCs w:val="22"/>
+        </w:rPr>
+        <w:t xml:space="preserve">11.  </w:t>
+      </w:r>
       <w:r>
         <w:rPr>
           <w:color w:val="000000"/>
@@ -399,14 +463,22 @@
           <w:sz w:val="20"/>
           <w:szCs w:val="20"/>
         </w:rPr>
-        <w:t xml:space="preserve">   (beide, 28.08.)</w:t>
-      </w:r>
-    </w:p>
-    <w:p>
-      <w:pPr>
-        <w:spacing w:after="100" w:line="264"/>
-        <w:ind w:left="340" w:hanging="340"/>
-      </w:pPr>
+        <w:t xml:space="preserve">   · beide</w:t>
+      </w:r>
+    </w:p>
+    <w:p>
+      <w:pPr>
+        <w:spacing w:after="100" w:line="264"/>
+        <w:ind w:left="560" w:hanging="560"/>
+      </w:pPr>
+      <w:r>
+        <w:rPr>
+          <w:color w:val="000000"/>
+          <w:sz w:val="22"/>
+          <w:szCs w:val="22"/>
+        </w:rPr>
+        <w:t xml:space="preserve">12.  </w:t>
+      </w:r>
       <w:r>
         <w:rPr>
           <w:color w:val="000000"/>
@@ -429,14 +501,22 @@
           <w:sz w:val="20"/>
           <w:szCs w:val="20"/>
         </w:rPr>
-        <w:t xml:space="preserve">   (Yannik, 28.08.)</w:t>
-      </w:r>
-    </w:p>
-    <w:p>
-      <w:pPr>
-        <w:spacing w:after="100" w:line="264"/>
-        <w:ind w:left="340" w:hanging="340"/>
-      </w:pPr>
+        <w:t xml:space="preserve">   · Yannik</w:t>
+      </w:r>
+    </w:p>
+    <w:p>
+      <w:pPr>
+        <w:spacing w:after="100" w:line="264"/>
+        <w:ind w:left="560" w:hanging="560"/>
+      </w:pPr>
+      <w:r>
+        <w:rPr>
+          <w:color w:val="000000"/>
+          <w:sz w:val="22"/>
+          <w:szCs w:val="22"/>
+        </w:rPr>
+        <w:t xml:space="preserve">13.  </w:t>
+      </w:r>
       <w:r>
         <w:rPr>
           <w:color w:val="000000"/>
@@ -459,14 +539,22 @@
           <w:sz w:val="20"/>
           <w:szCs w:val="20"/>
         </w:rPr>
-        <w:t xml:space="preserve">   (beide, 28.08.)</w:t>
-      </w:r>
-    </w:p>
-    <w:p>
-      <w:pPr>
-        <w:spacing w:after="100" w:line="264"/>
-        <w:ind w:left="340" w:hanging="340"/>
-      </w:pPr>
+        <w:t xml:space="preserve">   · beide</w:t>
+      </w:r>
+    </w:p>
+    <w:p>
+      <w:pPr>
+        <w:spacing w:after="100" w:line="264"/>
+        <w:ind w:left="560" w:hanging="560"/>
+      </w:pPr>
+      <w:r>
+        <w:rPr>
+          <w:color w:val="000000"/>
+          <w:sz w:val="22"/>
+          <w:szCs w:val="22"/>
+        </w:rPr>
+        <w:t xml:space="preserve">14.  </w:t>
+      </w:r>
       <w:r>
         <w:rPr>
           <w:color w:val="000000"/>
@@ -489,14 +577,22 @@
           <w:sz w:val="20"/>
           <w:szCs w:val="20"/>
         </w:rPr>
-        <w:t xml:space="preserve">   (Yannik, 28.08.)</w:t>
-      </w:r>
-    </w:p>
-    <w:p>
-      <w:pPr>
-        <w:spacing w:after="100" w:line="264"/>
-        <w:ind w:left="340" w:hanging="340"/>
-      </w:pPr>
+        <w:t xml:space="preserve">   · Yannik</w:t>
+      </w:r>
+    </w:p>
+    <w:p>
+      <w:pPr>
+        <w:spacing w:after="100" w:line="264"/>
+        <w:ind w:left="560" w:hanging="560"/>
+      </w:pPr>
+      <w:r>
+        <w:rPr>
+          <w:color w:val="000000"/>
+          <w:sz w:val="22"/>
+          <w:szCs w:val="22"/>
+        </w:rPr>
+        <w:t xml:space="preserve">15.  </w:t>
+      </w:r>
       <w:r>
         <w:rPr>
           <w:color w:val="000000"/>
@@ -519,14 +615,22 @@
           <w:sz w:val="20"/>
           <w:szCs w:val="20"/>
         </w:rPr>
-        <w:t xml:space="preserve">   (Yannik, 28.08.)</w:t>
-      </w:r>
-    </w:p>
-    <w:p>
-      <w:pPr>
-        <w:spacing w:after="100" w:line="264"/>
-        <w:ind w:left="340" w:hanging="340"/>
-      </w:pPr>
+        <w:t xml:space="preserve">   · Yannik</w:t>
+      </w:r>
+    </w:p>
+    <w:p>
+      <w:pPr>
+        <w:spacing w:after="100" w:line="264"/>
+        <w:ind w:left="560" w:hanging="560"/>
+      </w:pPr>
+      <w:r>
+        <w:rPr>
+          <w:color w:val="000000"/>
+          <w:sz w:val="22"/>
+          <w:szCs w:val="22"/>
+        </w:rPr>
+        <w:t xml:space="preserve">16.  </w:t>
+      </w:r>
       <w:r>
         <w:rPr>
           <w:color w:val="000000"/>
@@ -549,26 +653,22 @@
           <w:sz w:val="20"/>
           <w:szCs w:val="20"/>
         </w:rPr>
-        <w:t xml:space="preserve">   (Yannik, 28.08.)</w:t>
-      </w:r>
-    </w:p>
-    <w:p>
-      <w:pPr>
-        <w:pStyle w:val="Heading1"/>
-        <w:spacing w:after="120" w:before="320"/>
-      </w:pPr>
-      <w:r>
-        <w:rPr>
-          <w:color w:val="000000"/>
-        </w:rPr>
-        <w:t xml:space="preserve">Bis Freitag, 11.09.2026</w:t>
-      </w:r>
-    </w:p>
-    <w:p>
-      <w:pPr>
-        <w:spacing w:after="100" w:line="264"/>
-        <w:ind w:left="340" w:hanging="340"/>
-      </w:pPr>
+        <w:t xml:space="preserve">   · Yannik</w:t>
+      </w:r>
+    </w:p>
+    <w:p>
+      <w:pPr>
+        <w:spacing w:after="100" w:line="264"/>
+        <w:ind w:left="560" w:hanging="560"/>
+      </w:pPr>
+      <w:r>
+        <w:rPr>
+          <w:color w:val="000000"/>
+          <w:sz w:val="22"/>
+          <w:szCs w:val="22"/>
+        </w:rPr>
+        <w:t xml:space="preserve">17.  </w:t>
+      </w:r>
       <w:r>
         <w:rPr>
           <w:color w:val="000000"/>
@@ -591,14 +691,22 @@
           <w:sz w:val="20"/>
           <w:szCs w:val="20"/>
         </w:rPr>
-        <w:t xml:space="preserve">   (Yannik, 11.09.)</w:t>
-      </w:r>
-    </w:p>
-    <w:p>
-      <w:pPr>
-        <w:spacing w:after="100" w:line="264"/>
-        <w:ind w:left="340" w:hanging="340"/>
-      </w:pPr>
+        <w:t xml:space="preserve">   · Yannik</w:t>
+      </w:r>
+    </w:p>
+    <w:p>
+      <w:pPr>
+        <w:spacing w:after="100" w:line="264"/>
+        <w:ind w:left="560" w:hanging="560"/>
+      </w:pPr>
+      <w:r>
+        <w:rPr>
+          <w:color w:val="000000"/>
+          <w:sz w:val="22"/>
+          <w:szCs w:val="22"/>
+        </w:rPr>
+        <w:t xml:space="preserve">18.  </w:t>
+      </w:r>
       <w:r>
         <w:rPr>
           <w:color w:val="000000"/>
@@ -621,14 +729,22 @@
           <w:sz w:val="20"/>
           <w:szCs w:val="20"/>
         </w:rPr>
-        <w:t xml:space="preserve">   (Yannik, 11.09.)</w:t>
-      </w:r>
-    </w:p>
-    <w:p>
-      <w:pPr>
-        <w:spacing w:after="100" w:line="264"/>
-        <w:ind w:left="340" w:hanging="340"/>
-      </w:pPr>
+        <w:t xml:space="preserve">   · Yannik</w:t>
+      </w:r>
+    </w:p>
+    <w:p>
+      <w:pPr>
+        <w:spacing w:after="100" w:line="264"/>
+        <w:ind w:left="560" w:hanging="560"/>
+      </w:pPr>
+      <w:r>
+        <w:rPr>
+          <w:color w:val="000000"/>
+          <w:sz w:val="22"/>
+          <w:szCs w:val="22"/>
+        </w:rPr>
+        <w:t xml:space="preserve">19.  </w:t>
+      </w:r>
       <w:r>
         <w:rPr>
           <w:color w:val="000000"/>
@@ -651,14 +767,22 @@
           <w:sz w:val="20"/>
           <w:szCs w:val="20"/>
         </w:rPr>
-        <w:t xml:space="preserve">   (Yannik, 11.09.)</w:t>
-      </w:r>
-    </w:p>
-    <w:p>
-      <w:pPr>
-        <w:spacing w:after="100" w:line="264"/>
-        <w:ind w:left="340" w:hanging="340"/>
-      </w:pPr>
+        <w:t xml:space="preserve">   · Yannik</w:t>
+      </w:r>
+    </w:p>
+    <w:p>
+      <w:pPr>
+        <w:spacing w:after="100" w:line="264"/>
+        <w:ind w:left="560" w:hanging="560"/>
+      </w:pPr>
+      <w:r>
+        <w:rPr>
+          <w:color w:val="000000"/>
+          <w:sz w:val="22"/>
+          <w:szCs w:val="22"/>
+        </w:rPr>
+        <w:t xml:space="preserve">20.  </w:t>
+      </w:r>
       <w:r>
         <w:rPr>
           <w:color w:val="000000"/>
@@ -681,14 +805,22 @@
           <w:sz w:val="20"/>
           <w:szCs w:val="20"/>
         </w:rPr>
-        <w:t xml:space="preserve">   (Kira, 11.09.)</w:t>
-      </w:r>
-    </w:p>
-    <w:p>
-      <w:pPr>
-        <w:spacing w:after="100" w:line="264"/>
-        <w:ind w:left="340" w:hanging="340"/>
-      </w:pPr>
+        <w:t xml:space="preserve">   · Kira</w:t>
+      </w:r>
+    </w:p>
+    <w:p>
+      <w:pPr>
+        <w:spacing w:after="100" w:line="264"/>
+        <w:ind w:left="560" w:hanging="560"/>
+      </w:pPr>
+      <w:r>
+        <w:rPr>
+          <w:color w:val="000000"/>
+          <w:sz w:val="22"/>
+          <w:szCs w:val="22"/>
+        </w:rPr>
+        <w:t xml:space="preserve">21.  </w:t>
+      </w:r>
       <w:r>
         <w:rPr>
           <w:color w:val="000000"/>
@@ -711,14 +843,22 @@
           <w:sz w:val="20"/>
           <w:szCs w:val="20"/>
         </w:rPr>
-        <w:t xml:space="preserve">   (Kira, 11.09.)</w:t>
-      </w:r>
-    </w:p>
-    <w:p>
-      <w:pPr>
-        <w:spacing w:after="100" w:line="264"/>
-        <w:ind w:left="340" w:hanging="340"/>
-      </w:pPr>
+        <w:t xml:space="preserve">   · Kira</w:t>
+      </w:r>
+    </w:p>
+    <w:p>
+      <w:pPr>
+        <w:spacing w:after="100" w:line="264"/>
+        <w:ind w:left="560" w:hanging="560"/>
+      </w:pPr>
+      <w:r>
+        <w:rPr>
+          <w:color w:val="000000"/>
+          <w:sz w:val="22"/>
+          <w:szCs w:val="22"/>
+        </w:rPr>
+        <w:t xml:space="preserve">22.  </w:t>
+      </w:r>
       <w:r>
         <w:rPr>
           <w:color w:val="000000"/>
@@ -741,14 +881,22 @@
           <w:sz w:val="20"/>
           <w:szCs w:val="20"/>
         </w:rPr>
-        <w:t xml:space="preserve">   (beide, 11.09.)</w:t>
-      </w:r>
-    </w:p>
-    <w:p>
-      <w:pPr>
-        <w:spacing w:after="100" w:line="264"/>
-        <w:ind w:left="340" w:hanging="340"/>
-      </w:pPr>
+        <w:t xml:space="preserve">   · beide</w:t>
+      </w:r>
+    </w:p>
+    <w:p>
+      <w:pPr>
+        <w:spacing w:after="100" w:line="264"/>
+        <w:ind w:left="560" w:hanging="560"/>
+      </w:pPr>
+      <w:r>
+        <w:rPr>
+          <w:color w:val="000000"/>
+          <w:sz w:val="22"/>
+          <w:szCs w:val="22"/>
+        </w:rPr>
+        <w:t xml:space="preserve">23.  </w:t>
+      </w:r>
       <w:r>
         <w:rPr>
           <w:color w:val="000000"/>
@@ -771,14 +919,22 @@
           <w:sz w:val="20"/>
           <w:szCs w:val="20"/>
         </w:rPr>
-        <w:t xml:space="preserve">   (beide, 11.09.)</w:t>
-      </w:r>
-    </w:p>
-    <w:p>
-      <w:pPr>
-        <w:spacing w:after="100" w:line="264"/>
-        <w:ind w:left="340" w:hanging="340"/>
-      </w:pPr>
+        <w:t xml:space="preserve">   · beide</w:t>
+      </w:r>
+    </w:p>
+    <w:p>
+      <w:pPr>
+        <w:spacing w:after="100" w:line="264"/>
+        <w:ind w:left="560" w:hanging="560"/>
+      </w:pPr>
+      <w:r>
+        <w:rPr>
+          <w:color w:val="000000"/>
+          <w:sz w:val="22"/>
+          <w:szCs w:val="22"/>
+        </w:rPr>
+        <w:t xml:space="preserve">24.  </w:t>
+      </w:r>
       <w:r>
         <w:rPr>
           <w:color w:val="000000"/>
@@ -801,44 +957,60 @@
           <w:sz w:val="20"/>
           <w:szCs w:val="20"/>
         </w:rPr>
-        <w:t xml:space="preserve">   (Yannik, 11.09.)</w:t>
-      </w:r>
-    </w:p>
-    <w:p>
-      <w:pPr>
-        <w:spacing w:after="100" w:line="264"/>
-        <w:ind w:left="340" w:hanging="340"/>
-      </w:pPr>
-      <w:r>
-        <w:rPr>
-          <w:color w:val="000000"/>
-          <w:sz w:val="22"/>
-          <w:szCs w:val="22"/>
-        </w:rPr>
-        <w:t xml:space="preserve">☐   </w:t>
-      </w:r>
-      <w:r>
-        <w:rPr>
-          <w:color w:val="000000"/>
-          <w:sz w:val="22"/>
-          <w:szCs w:val="22"/>
-        </w:rPr>
-        <w:t xml:space="preserve">Die 15 % Minderung und den Einbehalt der Anzahlung prüfen lassen</w:t>
-      </w:r>
-      <w:r>
-        <w:rPr>
-          <w:color w:val="000000"/>
-          <w:sz w:val="20"/>
-          <w:szCs w:val="20"/>
-        </w:rPr>
-        <w:t xml:space="preserve">   (Yannik, 11.09.)</w:t>
-      </w:r>
-    </w:p>
-    <w:p>
-      <w:pPr>
-        <w:spacing w:after="100" w:line="264"/>
-        <w:ind w:left="340" w:hanging="340"/>
-      </w:pPr>
+        <w:t xml:space="preserve">   · Yannik</w:t>
+      </w:r>
+    </w:p>
+    <w:p>
+      <w:pPr>
+        <w:spacing w:after="100" w:line="264"/>
+        <w:ind w:left="560" w:hanging="560"/>
+      </w:pPr>
+      <w:r>
+        <w:rPr>
+          <w:color w:val="000000"/>
+          <w:sz w:val="22"/>
+          <w:szCs w:val="22"/>
+        </w:rPr>
+        <w:t xml:space="preserve">25.  </w:t>
+      </w:r>
+      <w:r>
+        <w:rPr>
+          <w:color w:val="000000"/>
+          <w:sz w:val="22"/>
+          <w:szCs w:val="22"/>
+        </w:rPr>
+        <w:t xml:space="preserve">☐   </w:t>
+      </w:r>
+      <w:r>
+        <w:rPr>
+          <w:color w:val="000000"/>
+          <w:sz w:val="22"/>
+          <w:szCs w:val="22"/>
+        </w:rPr>
+        <w:t xml:space="preserve">Minderung und Einbehalt der Anzahlung prüfen lassen</w:t>
+      </w:r>
+      <w:r>
+        <w:rPr>
+          <w:color w:val="000000"/>
+          <w:sz w:val="20"/>
+          <w:szCs w:val="20"/>
+        </w:rPr>
+        <w:t xml:space="preserve">   · Yannik</w:t>
+      </w:r>
+    </w:p>
+    <w:p>
+      <w:pPr>
+        <w:spacing w:after="100" w:line="264"/>
+        <w:ind w:left="560" w:hanging="560"/>
+      </w:pPr>
+      <w:r>
+        <w:rPr>
+          <w:color w:val="000000"/>
+          <w:sz w:val="22"/>
+          <w:szCs w:val="22"/>
+        </w:rPr>
+        <w:t xml:space="preserve">26.  </w:t>
+      </w:r>
       <w:r>
         <w:rPr>
           <w:color w:val="000000"/>
@@ -861,26 +1033,22 @@
           <w:sz w:val="20"/>
           <w:szCs w:val="20"/>
         </w:rPr>
-        <w:t xml:space="preserve">   (Yannik, 11.09.)</w:t>
-      </w:r>
-    </w:p>
-    <w:p>
-      <w:pPr>
-        <w:pStyle w:val="Heading1"/>
-        <w:spacing w:after="120" w:before="320"/>
-      </w:pPr>
-      <w:r>
-        <w:rPr>
-          <w:color w:val="000000"/>
-        </w:rPr>
-        <w:t xml:space="preserve">Bis Freitag, 25.09.2026</w:t>
-      </w:r>
-    </w:p>
-    <w:p>
-      <w:pPr>
-        <w:spacing w:after="100" w:line="264"/>
-        <w:ind w:left="340" w:hanging="340"/>
-      </w:pPr>
+        <w:t xml:space="preserve">   · Yannik</w:t>
+      </w:r>
+    </w:p>
+    <w:p>
+      <w:pPr>
+        <w:spacing w:after="100" w:line="264"/>
+        <w:ind w:left="560" w:hanging="560"/>
+      </w:pPr>
+      <w:r>
+        <w:rPr>
+          <w:color w:val="000000"/>
+          <w:sz w:val="22"/>
+          <w:szCs w:val="22"/>
+        </w:rPr>
+        <w:t xml:space="preserve">27.  </w:t>
+      </w:r>
       <w:r>
         <w:rPr>
           <w:color w:val="000000"/>
@@ -903,26 +1071,22 @@
           <w:sz w:val="20"/>
           <w:szCs w:val="20"/>
         </w:rPr>
-        <w:t xml:space="preserve">   (beide, 25.09.)</w:t>
-      </w:r>
-    </w:p>
-    <w:p>
-      <w:pPr>
-        <w:pStyle w:val="Heading1"/>
-        <w:spacing w:after="120" w:before="320"/>
-      </w:pPr>
-      <w:r>
-        <w:rPr>
-          <w:color w:val="000000"/>
-        </w:rPr>
-        <w:t xml:space="preserve">Bis Freitag, 02.10.2026</w:t>
-      </w:r>
-    </w:p>
-    <w:p>
-      <w:pPr>
-        <w:spacing w:after="100" w:line="264"/>
-        <w:ind w:left="340" w:hanging="340"/>
-      </w:pPr>
+        <w:t xml:space="preserve">   · beide</w:t>
+      </w:r>
+    </w:p>
+    <w:p>
+      <w:pPr>
+        <w:spacing w:after="100" w:line="264"/>
+        <w:ind w:left="560" w:hanging="560"/>
+      </w:pPr>
+      <w:r>
+        <w:rPr>
+          <w:color w:val="000000"/>
+          <w:sz w:val="22"/>
+          <w:szCs w:val="22"/>
+        </w:rPr>
+        <w:t xml:space="preserve">28.  </w:t>
+      </w:r>
       <w:r>
         <w:rPr>
           <w:color w:val="000000"/>
@@ -945,14 +1109,22 @@
           <w:sz w:val="20"/>
           <w:szCs w:val="20"/>
         </w:rPr>
-        <w:t xml:space="preserve">   (Kira, 02.10.)</w:t>
-      </w:r>
-    </w:p>
-    <w:p>
-      <w:pPr>
-        <w:spacing w:after="100" w:line="264"/>
-        <w:ind w:left="340" w:hanging="340"/>
-      </w:pPr>
+        <w:t xml:space="preserve">   · Kira</w:t>
+      </w:r>
+    </w:p>
+    <w:p>
+      <w:pPr>
+        <w:spacing w:after="100" w:line="264"/>
+        <w:ind w:left="560" w:hanging="560"/>
+      </w:pPr>
+      <w:r>
+        <w:rPr>
+          <w:color w:val="000000"/>
+          <w:sz w:val="22"/>
+          <w:szCs w:val="22"/>
+        </w:rPr>
+        <w:t xml:space="preserve">29.  </w:t>
+      </w:r>
       <w:r>
         <w:rPr>
           <w:color w:val="000000"/>
@@ -975,14 +1147,22 @@
           <w:sz w:val="20"/>
           <w:szCs w:val="20"/>
         </w:rPr>
-        <w:t xml:space="preserve">   (Kira, 02.10.)</w:t>
-      </w:r>
-    </w:p>
-    <w:p>
-      <w:pPr>
-        <w:spacing w:after="100" w:line="264"/>
-        <w:ind w:left="340" w:hanging="340"/>
-      </w:pPr>
+        <w:t xml:space="preserve">   · Kira</w:t>
+      </w:r>
+    </w:p>
+    <w:p>
+      <w:pPr>
+        <w:spacing w:after="100" w:line="264"/>
+        <w:ind w:left="560" w:hanging="560"/>
+      </w:pPr>
+      <w:r>
+        <w:rPr>
+          <w:color w:val="000000"/>
+          <w:sz w:val="22"/>
+          <w:szCs w:val="22"/>
+        </w:rPr>
+        <w:t xml:space="preserve">30.  </w:t>
+      </w:r>
       <w:r>
         <w:rPr>
           <w:color w:val="000000"/>
@@ -1005,14 +1185,22 @@
           <w:sz w:val="20"/>
           <w:szCs w:val="20"/>
         </w:rPr>
-        <w:t xml:space="preserve">   (Kira, 02.10.)</w:t>
-      </w:r>
-    </w:p>
-    <w:p>
-      <w:pPr>
-        <w:spacing w:after="100" w:line="264"/>
-        <w:ind w:left="340" w:hanging="340"/>
-      </w:pPr>
+        <w:t xml:space="preserve">   · Kira</w:t>
+      </w:r>
+    </w:p>
+    <w:p>
+      <w:pPr>
+        <w:spacing w:after="100" w:line="264"/>
+        <w:ind w:left="560" w:hanging="560"/>
+      </w:pPr>
+      <w:r>
+        <w:rPr>
+          <w:color w:val="000000"/>
+          <w:sz w:val="22"/>
+          <w:szCs w:val="22"/>
+        </w:rPr>
+        <w:t xml:space="preserve">31.  </w:t>
+      </w:r>
       <w:r>
         <w:rPr>
           <w:color w:val="000000"/>
@@ -1035,14 +1223,22 @@
           <w:sz w:val="20"/>
           <w:szCs w:val="20"/>
         </w:rPr>
-        <w:t xml:space="preserve">   (Kira, 02.10.)</w:t>
-      </w:r>
-    </w:p>
-    <w:p>
-      <w:pPr>
-        <w:spacing w:after="100" w:line="264"/>
-        <w:ind w:left="340" w:hanging="340"/>
-      </w:pPr>
+        <w:t xml:space="preserve">   · Kira</w:t>
+      </w:r>
+    </w:p>
+    <w:p>
+      <w:pPr>
+        <w:spacing w:after="100" w:line="264"/>
+        <w:ind w:left="560" w:hanging="560"/>
+      </w:pPr>
+      <w:r>
+        <w:rPr>
+          <w:color w:val="000000"/>
+          <w:sz w:val="22"/>
+          <w:szCs w:val="22"/>
+        </w:rPr>
+        <w:t xml:space="preserve">32.  </w:t>
+      </w:r>
       <w:r>
         <w:rPr>
           <w:color w:val="000000"/>
@@ -1065,14 +1261,22 @@
           <w:sz w:val="20"/>
           <w:szCs w:val="20"/>
         </w:rPr>
-        <w:t xml:space="preserve">   (beide, 02.10.)</w:t>
-      </w:r>
-    </w:p>
-    <w:p>
-      <w:pPr>
-        <w:spacing w:after="100" w:line="264"/>
-        <w:ind w:left="340" w:hanging="340"/>
-      </w:pPr>
+        <w:t xml:space="preserve">   · beide</w:t>
+      </w:r>
+    </w:p>
+    <w:p>
+      <w:pPr>
+        <w:spacing w:after="100" w:line="264"/>
+        <w:ind w:left="560" w:hanging="560"/>
+      </w:pPr>
+      <w:r>
+        <w:rPr>
+          <w:color w:val="000000"/>
+          <w:sz w:val="22"/>
+          <w:szCs w:val="22"/>
+        </w:rPr>
+        <w:t xml:space="preserve">33.  </w:t>
+      </w:r>
       <w:r>
         <w:rPr>
           <w:color w:val="000000"/>
@@ -1095,14 +1299,22 @@
           <w:sz w:val="20"/>
           <w:szCs w:val="20"/>
         </w:rPr>
-        <w:t xml:space="preserve">   (Kira, 02.10.)</w:t>
-      </w:r>
-    </w:p>
-    <w:p>
-      <w:pPr>
-        <w:spacing w:after="100" w:line="264"/>
-        <w:ind w:left="340" w:hanging="340"/>
-      </w:pPr>
+        <w:t xml:space="preserve">   · Kira</w:t>
+      </w:r>
+    </w:p>
+    <w:p>
+      <w:pPr>
+        <w:spacing w:after="100" w:line="264"/>
+        <w:ind w:left="560" w:hanging="560"/>
+      </w:pPr>
+      <w:r>
+        <w:rPr>
+          <w:color w:val="000000"/>
+          <w:sz w:val="22"/>
+          <w:szCs w:val="22"/>
+        </w:rPr>
+        <w:t xml:space="preserve">34.  </w:t>
+      </w:r>
       <w:r>
         <w:rPr>
           <w:color w:val="000000"/>
@@ -1125,14 +1337,22 @@
           <w:sz w:val="20"/>
           <w:szCs w:val="20"/>
         </w:rPr>
-        <w:t xml:space="preserve">   (beide, 02.10.)</w:t>
-      </w:r>
-    </w:p>
-    <w:p>
-      <w:pPr>
-        <w:spacing w:after="100" w:line="264"/>
-        <w:ind w:left="340" w:hanging="340"/>
-      </w:pPr>
+        <w:t xml:space="preserve">   · beide</w:t>
+      </w:r>
+    </w:p>
+    <w:p>
+      <w:pPr>
+        <w:spacing w:after="100" w:line="264"/>
+        <w:ind w:left="560" w:hanging="560"/>
+      </w:pPr>
+      <w:r>
+        <w:rPr>
+          <w:color w:val="000000"/>
+          <w:sz w:val="22"/>
+          <w:szCs w:val="22"/>
+        </w:rPr>
+        <w:t xml:space="preserve">35.  </w:t>
+      </w:r>
       <w:r>
         <w:rPr>
           <w:color w:val="000000"/>
@@ -1155,14 +1375,22 @@
           <w:sz w:val="20"/>
           <w:szCs w:val="20"/>
         </w:rPr>
-        <w:t xml:space="preserve">   (beide, 02.10.)</w:t>
-      </w:r>
-    </w:p>
-    <w:p>
-      <w:pPr>
-        <w:spacing w:after="100" w:line="264"/>
-        <w:ind w:left="340" w:hanging="340"/>
-      </w:pPr>
+        <w:t xml:space="preserve">   · beide</w:t>
+      </w:r>
+    </w:p>
+    <w:p>
+      <w:pPr>
+        <w:spacing w:after="100" w:line="264"/>
+        <w:ind w:left="560" w:hanging="560"/>
+      </w:pPr>
+      <w:r>
+        <w:rPr>
+          <w:color w:val="000000"/>
+          <w:sz w:val="22"/>
+          <w:szCs w:val="22"/>
+        </w:rPr>
+        <w:t xml:space="preserve">36.  </w:t>
+      </w:r>
       <w:r>
         <w:rPr>
           <w:color w:val="000000"/>
@@ -1185,14 +1413,22 @@
           <w:sz w:val="20"/>
           <w:szCs w:val="20"/>
         </w:rPr>
-        <w:t xml:space="preserve">   (Kira, 02.10.)</w:t>
-      </w:r>
-    </w:p>
-    <w:p>
-      <w:pPr>
-        <w:spacing w:after="100" w:line="264"/>
-        <w:ind w:left="340" w:hanging="340"/>
-      </w:pPr>
+        <w:t xml:space="preserve">   · Kira</w:t>
+      </w:r>
+    </w:p>
+    <w:p>
+      <w:pPr>
+        <w:spacing w:after="100" w:line="264"/>
+        <w:ind w:left="560" w:hanging="560"/>
+      </w:pPr>
+      <w:r>
+        <w:rPr>
+          <w:color w:val="000000"/>
+          <w:sz w:val="22"/>
+          <w:szCs w:val="22"/>
+        </w:rPr>
+        <w:t xml:space="preserve">37.  </w:t>
+      </w:r>
       <w:r>
         <w:rPr>
           <w:color w:val="000000"/>
@@ -1215,26 +1451,22 @@
           <w:sz w:val="20"/>
           <w:szCs w:val="20"/>
         </w:rPr>
-        <w:t xml:space="preserve">   (Kira, 02.10.)</w:t>
-      </w:r>
-    </w:p>
-    <w:p>
-      <w:pPr>
-        <w:pStyle w:val="Heading1"/>
-        <w:spacing w:after="120" w:before="320"/>
-      </w:pPr>
-      <w:r>
-        <w:rPr>
-          <w:color w:val="000000"/>
-        </w:rPr>
-        <w:t xml:space="preserve">Tag 1 bis Tag 90</w:t>
-      </w:r>
-    </w:p>
-    <w:p>
-      <w:pPr>
-        <w:spacing w:after="100" w:line="264"/>
-        <w:ind w:left="340" w:hanging="340"/>
-      </w:pPr>
+        <w:t xml:space="preserve">   · Kira</w:t>
+      </w:r>
+    </w:p>
+    <w:p>
+      <w:pPr>
+        <w:spacing w:after="100" w:line="264"/>
+        <w:ind w:left="560" w:hanging="560"/>
+      </w:pPr>
+      <w:r>
+        <w:rPr>
+          <w:color w:val="000000"/>
+          <w:sz w:val="22"/>
+          <w:szCs w:val="22"/>
+        </w:rPr>
+        <w:t xml:space="preserve">38.  </w:t>
+      </w:r>
       <w:r>
         <w:rPr>
           <w:color w:val="000000"/>
@@ -1257,14 +1489,30 @@
           <w:sz w:val="20"/>
           <w:szCs w:val="20"/>
         </w:rPr>
-        <w:t xml:space="preserve">   (beide, laufend ab 05.10.)</w:t>
-      </w:r>
-    </w:p>
-    <w:p>
-      <w:pPr>
-        <w:spacing w:after="100" w:line="264"/>
-        <w:ind w:left="340" w:hanging="340"/>
-      </w:pPr>
+        <w:t xml:space="preserve"> (laufend)</w:t>
+      </w:r>
+      <w:r>
+        <w:rPr>
+          <w:color w:val="000000"/>
+          <w:sz w:val="20"/>
+          <w:szCs w:val="20"/>
+        </w:rPr>
+        <w:t xml:space="preserve">   · beide</w:t>
+      </w:r>
+    </w:p>
+    <w:p>
+      <w:pPr>
+        <w:spacing w:after="100" w:line="264"/>
+        <w:ind w:left="560" w:hanging="560"/>
+      </w:pPr>
+      <w:r>
+        <w:rPr>
+          <w:color w:val="000000"/>
+          <w:sz w:val="22"/>
+          <w:szCs w:val="22"/>
+        </w:rPr>
+        <w:t xml:space="preserve">39.  </w:t>
+      </w:r>
       <w:r>
         <w:rPr>
           <w:color w:val="000000"/>
@@ -1287,14 +1535,30 @@
           <w:sz w:val="20"/>
           <w:szCs w:val="20"/>
         </w:rPr>
-        <w:t xml:space="preserve">   (beide, jede Woche ab 05.10.)</w:t>
-      </w:r>
-    </w:p>
-    <w:p>
-      <w:pPr>
-        <w:spacing w:after="100" w:line="264"/>
-        <w:ind w:left="340" w:hanging="340"/>
-      </w:pPr>
+        <w:t xml:space="preserve"> (jede Woche)</w:t>
+      </w:r>
+      <w:r>
+        <w:rPr>
+          <w:color w:val="000000"/>
+          <w:sz w:val="20"/>
+          <w:szCs w:val="20"/>
+        </w:rPr>
+        <w:t xml:space="preserve">   · beide</w:t>
+      </w:r>
+    </w:p>
+    <w:p>
+      <w:pPr>
+        <w:spacing w:after="100" w:line="264"/>
+        <w:ind w:left="560" w:hanging="560"/>
+      </w:pPr>
+      <w:r>
+        <w:rPr>
+          <w:color w:val="000000"/>
+          <w:sz w:val="22"/>
+          <w:szCs w:val="22"/>
+        </w:rPr>
+        <w:t xml:space="preserve">40.  </w:t>
+      </w:r>
       <w:r>
         <w:rPr>
           <w:color w:val="000000"/>
@@ -1317,14 +1581,22 @@
           <w:sz w:val="20"/>
           <w:szCs w:val="20"/>
         </w:rPr>
-        <w:t xml:space="preserve">   (beide, 06.11.)</w:t>
-      </w:r>
-    </w:p>
-    <w:p>
-      <w:pPr>
-        <w:spacing w:after="100" w:line="264"/>
-        <w:ind w:left="340" w:hanging="340"/>
-      </w:pPr>
+        <w:t xml:space="preserve">   · beide</w:t>
+      </w:r>
+    </w:p>
+    <w:p>
+      <w:pPr>
+        <w:spacing w:after="100" w:line="264"/>
+        <w:ind w:left="560" w:hanging="560"/>
+      </w:pPr>
+      <w:r>
+        <w:rPr>
+          <w:color w:val="000000"/>
+          <w:sz w:val="22"/>
+          <w:szCs w:val="22"/>
+        </w:rPr>
+        <w:t xml:space="preserve">41.  </w:t>
+      </w:r>
       <w:r>
         <w:rPr>
           <w:color w:val="000000"/>
@@ -1347,14 +1619,22 @@
           <w:sz w:val="20"/>
           <w:szCs w:val="20"/>
         </w:rPr>
-        <w:t xml:space="preserve">   (beide, 27.11.)</w:t>
-      </w:r>
-    </w:p>
-    <w:p>
-      <w:pPr>
-        <w:spacing w:after="100" w:line="264"/>
-        <w:ind w:left="340" w:hanging="340"/>
-      </w:pPr>
+        <w:t xml:space="preserve">   · beide</w:t>
+      </w:r>
+    </w:p>
+    <w:p>
+      <w:pPr>
+        <w:spacing w:after="100" w:line="264"/>
+        <w:ind w:left="560" w:hanging="560"/>
+      </w:pPr>
+      <w:r>
+        <w:rPr>
+          <w:color w:val="000000"/>
+          <w:sz w:val="22"/>
+          <w:szCs w:val="22"/>
+        </w:rPr>
+        <w:t xml:space="preserve">42.  </w:t>
+      </w:r>
       <w:r>
         <w:rPr>
           <w:color w:val="000000"/>
@@ -1377,14 +1657,22 @@
           <w:sz w:val="20"/>
           <w:szCs w:val="20"/>
         </w:rPr>
-        <w:t xml:space="preserve">   (beide, 02.01.)</w:t>
-      </w:r>
-    </w:p>
-    <w:p>
-      <w:pPr>
-        <w:spacing w:after="100" w:line="264"/>
-        <w:ind w:left="340" w:hanging="340"/>
-      </w:pPr>
+        <w:t xml:space="preserve">   · beide</w:t>
+      </w:r>
+    </w:p>
+    <w:p>
+      <w:pPr>
+        <w:spacing w:after="100" w:line="264"/>
+        <w:ind w:left="560" w:hanging="560"/>
+      </w:pPr>
+      <w:r>
+        <w:rPr>
+          <w:color w:val="000000"/>
+          <w:sz w:val="22"/>
+          <w:szCs w:val="22"/>
+        </w:rPr>
+        <w:t xml:space="preserve">43.  </w:t>
+      </w:r>
       <w:r>
         <w:rPr>
           <w:color w:val="000000"/>
@@ -1407,14 +1695,22 @@
           <w:sz w:val="20"/>
           <w:szCs w:val="20"/>
         </w:rPr>
-        <w:t xml:space="preserve">   (beide, 02.01.)</w:t>
-      </w:r>
-    </w:p>
-    <w:p>
-      <w:pPr>
-        <w:spacing w:after="100" w:line="264"/>
-        <w:ind w:left="340" w:hanging="340"/>
-      </w:pPr>
+        <w:t xml:space="preserve">   · beide</w:t>
+      </w:r>
+    </w:p>
+    <w:p>
+      <w:pPr>
+        <w:spacing w:after="100" w:line="264"/>
+        <w:ind w:left="560" w:hanging="560"/>
+      </w:pPr>
+      <w:r>
+        <w:rPr>
+          <w:color w:val="000000"/>
+          <w:sz w:val="22"/>
+          <w:szCs w:val="22"/>
+        </w:rPr>
+        <w:t xml:space="preserve">44.  </w:t>
+      </w:r>
       <w:r>
         <w:rPr>
           <w:color w:val="000000"/>
@@ -1437,44 +1733,60 @@
           <w:sz w:val="20"/>
           <w:szCs w:val="20"/>
         </w:rPr>
-        <w:t xml:space="preserve">   (Kira, 02.01.)</w:t>
-      </w:r>
-    </w:p>
-    <w:p>
-      <w:pPr>
-        <w:spacing w:after="100" w:line="264"/>
-        <w:ind w:left="340" w:hanging="340"/>
-      </w:pPr>
-      <w:r>
-        <w:rPr>
-          <w:color w:val="000000"/>
-          <w:sz w:val="22"/>
-          <w:szCs w:val="22"/>
-        </w:rPr>
-        <w:t xml:space="preserve">☐   </w:t>
-      </w:r>
-      <w:r>
-        <w:rPr>
-          <w:color w:val="000000"/>
-          <w:sz w:val="22"/>
-          <w:szCs w:val="22"/>
-        </w:rPr>
-        <w:t xml:space="preserve">Nach Projekt 3: Produktionsvorlage ableiten und entscheiden, ob Paket S bleibt</w:t>
-      </w:r>
-      <w:r>
-        <w:rPr>
-          <w:color w:val="000000"/>
-          <w:sz w:val="20"/>
-          <w:szCs w:val="20"/>
-        </w:rPr>
-        <w:t xml:space="preserve">   (Kira, 02.01.)</w:t>
-      </w:r>
-    </w:p>
-    <w:p>
-      <w:pPr>
-        <w:spacing w:after="100" w:line="264"/>
-        <w:ind w:left="340" w:hanging="340"/>
-      </w:pPr>
+        <w:t xml:space="preserve">   · Kira</w:t>
+      </w:r>
+    </w:p>
+    <w:p>
+      <w:pPr>
+        <w:spacing w:after="100" w:line="264"/>
+        <w:ind w:left="560" w:hanging="560"/>
+      </w:pPr>
+      <w:r>
+        <w:rPr>
+          <w:color w:val="000000"/>
+          <w:sz w:val="22"/>
+          <w:szCs w:val="22"/>
+        </w:rPr>
+        <w:t xml:space="preserve">45.  </w:t>
+      </w:r>
+      <w:r>
+        <w:rPr>
+          <w:color w:val="000000"/>
+          <w:sz w:val="22"/>
+          <w:szCs w:val="22"/>
+        </w:rPr>
+        <w:t xml:space="preserve">☐   </w:t>
+      </w:r>
+      <w:r>
+        <w:rPr>
+          <w:color w:val="000000"/>
+          <w:sz w:val="22"/>
+          <w:szCs w:val="22"/>
+        </w:rPr>
+        <w:t xml:space="preserve">Nach Projekt 3: Paket S behalten oder streichen?</w:t>
+      </w:r>
+      <w:r>
+        <w:rPr>
+          <w:color w:val="000000"/>
+          <w:sz w:val="20"/>
+          <w:szCs w:val="20"/>
+        </w:rPr>
+        <w:t xml:space="preserve">   · Kira</w:t>
+      </w:r>
+    </w:p>
+    <w:p>
+      <w:pPr>
+        <w:spacing w:after="100" w:line="264"/>
+        <w:ind w:left="560" w:hanging="560"/>
+      </w:pPr>
+      <w:r>
+        <w:rPr>
+          <w:color w:val="000000"/>
+          <w:sz w:val="22"/>
+          <w:szCs w:val="22"/>
+        </w:rPr>
+        <w:t xml:space="preserve">46.  </w:t>
+      </w:r>
       <w:r>
         <w:rPr>
           <w:color w:val="000000"/>
@@ -1497,26 +1809,22 @@
           <w:sz w:val="20"/>
           <w:szCs w:val="20"/>
         </w:rPr>
-        <w:t xml:space="preserve">   (beide, 02.01.)</w:t>
-      </w:r>
-    </w:p>
-    <w:p>
-      <w:pPr>
-        <w:pStyle w:val="Heading1"/>
-        <w:spacing w:after="120" w:before="320"/>
-      </w:pPr>
-      <w:r>
-        <w:rPr>
-          <w:color w:val="000000"/>
-        </w:rPr>
-        <w:t xml:space="preserve">An ein Ereignis gebunden</w:t>
-      </w:r>
-    </w:p>
-    <w:p>
-      <w:pPr>
-        <w:spacing w:after="100" w:line="264"/>
-        <w:ind w:left="340" w:hanging="340"/>
-      </w:pPr>
+        <w:t xml:space="preserve">   · beide</w:t>
+      </w:r>
+    </w:p>
+    <w:p>
+      <w:pPr>
+        <w:spacing w:after="100" w:line="264"/>
+        <w:ind w:left="560" w:hanging="560"/>
+      </w:pPr>
+      <w:r>
+        <w:rPr>
+          <w:color w:val="000000"/>
+          <w:sz w:val="22"/>
+          <w:szCs w:val="22"/>
+        </w:rPr>
+        <w:t xml:space="preserve">47.  </w:t>
+      </w:r>
       <w:r>
         <w:rPr>
           <w:color w:val="000000"/>
@@ -1539,14 +1847,30 @@
           <w:sz w:val="20"/>
           <w:szCs w:val="20"/>
         </w:rPr>
-        <w:t xml:space="preserve">   (Kira, vor dem ersten Betreuungsvertrag, spätestens 02.01.)</w:t>
-      </w:r>
-    </w:p>
-    <w:p>
-      <w:pPr>
-        <w:spacing w:after="100" w:line="264"/>
-        <w:ind w:left="340" w:hanging="340"/>
-      </w:pPr>
+        <w:t xml:space="preserve"> (vor dem ersten Betreuungsvertrag)</w:t>
+      </w:r>
+      <w:r>
+        <w:rPr>
+          <w:color w:val="000000"/>
+          <w:sz w:val="20"/>
+          <w:szCs w:val="20"/>
+        </w:rPr>
+        <w:t xml:space="preserve">   · Kira</w:t>
+      </w:r>
+    </w:p>
+    <w:p>
+      <w:pPr>
+        <w:spacing w:after="100" w:line="264"/>
+        <w:ind w:left="560" w:hanging="560"/>
+      </w:pPr>
+      <w:r>
+        <w:rPr>
+          <w:color w:val="000000"/>
+          <w:sz w:val="22"/>
+          <w:szCs w:val="22"/>
+        </w:rPr>
+        <w:t xml:space="preserve">48.  </w:t>
+      </w:r>
       <w:r>
         <w:rPr>
           <w:color w:val="000000"/>
@@ -1569,14 +1893,30 @@
           <w:sz w:val="20"/>
           <w:szCs w:val="20"/>
         </w:rPr>
-        <w:t xml:space="preserve">   (Yannik, vor der ersten Rechnung, spätestens 02.01.)</w:t>
-      </w:r>
-    </w:p>
-    <w:p>
-      <w:pPr>
-        <w:spacing w:after="100" w:line="264"/>
-        <w:ind w:left="340" w:hanging="340"/>
-      </w:pPr>
+        <w:t xml:space="preserve"> (vor der ersten Rechnung)</w:t>
+      </w:r>
+      <w:r>
+        <w:rPr>
+          <w:color w:val="000000"/>
+          <w:sz w:val="20"/>
+          <w:szCs w:val="20"/>
+        </w:rPr>
+        <w:t xml:space="preserve">   · Yannik</w:t>
+      </w:r>
+    </w:p>
+    <w:p>
+      <w:pPr>
+        <w:spacing w:after="100" w:line="264"/>
+        <w:ind w:left="560" w:hanging="560"/>
+      </w:pPr>
+      <w:r>
+        <w:rPr>
+          <w:color w:val="000000"/>
+          <w:sz w:val="22"/>
+          <w:szCs w:val="22"/>
+        </w:rPr>
+        <w:t xml:space="preserve">49.  </w:t>
+      </w:r>
       <w:r>
         <w:rPr>
           <w:color w:val="000000"/>
@@ -1599,14 +1939,30 @@
           <w:sz w:val="20"/>
           <w:szCs w:val="20"/>
         </w:rPr>
-        <w:t xml:space="preserve">   (beide, vor dem ersten Livegang auf Kundendomain)</w:t>
-      </w:r>
-    </w:p>
-    <w:p>
-      <w:pPr>
-        <w:spacing w:after="100" w:line="264"/>
-        <w:ind w:left="340" w:hanging="340"/>
-      </w:pPr>
+        <w:t xml:space="preserve"> (vor dem ersten Livegang auf Kundendomain)</w:t>
+      </w:r>
+      <w:r>
+        <w:rPr>
+          <w:color w:val="000000"/>
+          <w:sz w:val="20"/>
+          <w:szCs w:val="20"/>
+        </w:rPr>
+        <w:t xml:space="preserve">   · beide</w:t>
+      </w:r>
+    </w:p>
+    <w:p>
+      <w:pPr>
+        <w:spacing w:after="100" w:line="264"/>
+        <w:ind w:left="560" w:hanging="560"/>
+      </w:pPr>
+      <w:r>
+        <w:rPr>
+          <w:color w:val="000000"/>
+          <w:sz w:val="22"/>
+          <w:szCs w:val="22"/>
+        </w:rPr>
+        <w:t xml:space="preserve">50.  </w:t>
+      </w:r>
       <w:r>
         <w:rPr>
           <w:color w:val="000000"/>
@@ -1629,19 +1985,15 @@
           <w:sz w:val="20"/>
           <w:szCs w:val="20"/>
         </w:rPr>
-        <w:t xml:space="preserve">   (beide, am Tag der ersten Absage)</w:t>
-      </w:r>
-    </w:p>
-    <w:p>
-      <w:pPr>
-        <w:pStyle w:val="Heading1"/>
-        <w:spacing w:after="120" w:before="320"/>
-      </w:pPr>
-      <w:r>
-        <w:rPr>
-          <w:color w:val="000000"/>
-        </w:rPr>
-        <w:t xml:space="preserve">Zuerst</w:t>
+        <w:t xml:space="preserve"> (am Tag der ersten Absage)</w:t>
+      </w:r>
+      <w:r>
+        <w:rPr>
+          <w:color w:val="000000"/>
+          <w:sz w:val="20"/>
+          <w:szCs w:val="20"/>
+        </w:rPr>
+        <w:t xml:space="preserve">   · beide</w:t>
       </w:r>
     </w:p>
     <w:p>
@@ -1658,7 +2010,24 @@
           <w:sz w:val="22"/>
           <w:szCs w:val="22"/>
         </w:rPr>
-        <w:t xml:space="preserve">Die ladungsfähige Anschrift. Ohne sie trägt jeder Check einen roten Sperrbalken und darf nicht übergeben werden — elf fertige Pakete warten nur darauf. Es ist eine Entscheidung, keine Recherche.</w:t>
+        <w:t xml:space="preserve"/>
+      </w:r>
+    </w:p>
+    <w:p>
+      <w:pPr>
+        <w:spacing w:after="160" w:line="276"/>
+      </w:pPr>
+      <w:r>
+        <w:rPr>
+          <w:b w:val="false"/>
+          <w:bCs w:val="false"/>
+          <w:i w:val="false"/>
+          <w:iCs w:val="false"/>
+          <w:color w:val="000000"/>
+          <w:sz w:val="22"/>
+          <w:szCs w:val="22"/>
+        </w:rPr>
+        <w:t xml:space="preserve">Nummer 1 ist die einzige, die wirklich eilt: Ohne die ladungsfähige Anschrift darf keiner der elf fertigen Checks das Haus verlassen.</w:t>
       </w:r>
     </w:p>
     <w:sectPr>

</xml_diff>